<commit_message>
fix(html): grow a lowered run's line downward like Word (#948)
Word for the web's PDF of the new CASE7 (CASE1 with w:position -6 on its
first line) keeps the line's baseline, draws the run 3 pt below it and
moves every later line down 3 pt. The converter lowered the run with
relative positioning, which never grows the line; it now uses
vertical-align, as it has for a raised run since #941.
</commit_message>
<xml_diff>
--- a/npm/tests/fixtures/line-baselines-plain-marks.docx
+++ b/npm/tests/fixtures/line-baselines-plain-marks.docx
@@ -154,6 +154,37 @@
           <w:szCs w:val="22"/>
         </w:rPr>
         <w:t xml:space="preserve">raised</w:t>
+      </w:r>
+      <w:r>
+        <w:rPr>
+          <w:rFonts w:ascii="Calibri" w:hAnsi="Calibri" w:cs="Calibri"/>
+          <w:sz w:val="22"/>
+          <w:szCs w:val="22"/>
+        </w:rPr>
+        <w:t xml:space="preserve"> The quick brown fox jumps over the lazy dog while the editor counts every line. The quick brown fox jumps over the lazy dog while the editor counts every line. The quick brown fox jumps over the lazy dog while the editor counts every line. The quick brown fox jumps over the lazy dog while the editor counts every line. </w:t>
+      </w:r>
+    </w:p>
+    <w:p>
+      <w:pPr>
+        <w:pageBreakBefore/>
+        <w:spacing w:before="0" w:after="0" w:line="276" w:lineRule="auto"/>
+      </w:pPr>
+      <w:r>
+        <w:rPr>
+          <w:rFonts w:ascii="Calibri" w:hAnsi="Calibri" w:cs="Calibri"/>
+          <w:sz w:val="22"/>
+          <w:szCs w:val="22"/>
+        </w:rPr>
+        <w:t xml:space="preserve">CASE7 </w:t>
+      </w:r>
+      <w:r>
+        <w:rPr>
+          <w:rFonts w:ascii="Calibri" w:hAnsi="Calibri" w:cs="Calibri"/>
+          <w:position w:val="-6"/>
+          <w:sz w:val="22"/>
+          <w:szCs w:val="22"/>
+        </w:rPr>
+        <w:t xml:space="preserve">lowered</w:t>
       </w:r>
       <w:r>
         <w:rPr>

</xml_diff>

<commit_message>
fix(html): grow a lowered run's line downward like Word (#948) (#952)
* fix(html): grow a lowered run's line downward like Word (#948)

Word for the web's PDF of the new CASE7 (CASE1 with w:position -6 on its
first line) keeps the line's baseline, draws the run 3 pt below it and
moves every later line down 3 pt. The converter lowered the run with
relative positioning, which never grows the line; it now uses
vertical-align, as it has for a raised run since #941.

* docs(html): rewrap the auto-spacing comment (#948)
</commit_message>
<xml_diff>
--- a/npm/tests/fixtures/line-baselines-plain-marks.docx
+++ b/npm/tests/fixtures/line-baselines-plain-marks.docx
@@ -154,6 +154,37 @@
           <w:szCs w:val="22"/>
         </w:rPr>
         <w:t xml:space="preserve">raised</w:t>
+      </w:r>
+      <w:r>
+        <w:rPr>
+          <w:rFonts w:ascii="Calibri" w:hAnsi="Calibri" w:cs="Calibri"/>
+          <w:sz w:val="22"/>
+          <w:szCs w:val="22"/>
+        </w:rPr>
+        <w:t xml:space="preserve"> The quick brown fox jumps over the lazy dog while the editor counts every line. The quick brown fox jumps over the lazy dog while the editor counts every line. The quick brown fox jumps over the lazy dog while the editor counts every line. The quick brown fox jumps over the lazy dog while the editor counts every line. </w:t>
+      </w:r>
+    </w:p>
+    <w:p>
+      <w:pPr>
+        <w:pageBreakBefore/>
+        <w:spacing w:before="0" w:after="0" w:line="276" w:lineRule="auto"/>
+      </w:pPr>
+      <w:r>
+        <w:rPr>
+          <w:rFonts w:ascii="Calibri" w:hAnsi="Calibri" w:cs="Calibri"/>
+          <w:sz w:val="22"/>
+          <w:szCs w:val="22"/>
+        </w:rPr>
+        <w:t xml:space="preserve">CASE7 </w:t>
+      </w:r>
+      <w:r>
+        <w:rPr>
+          <w:rFonts w:ascii="Calibri" w:hAnsi="Calibri" w:cs="Calibri"/>
+          <w:position w:val="-6"/>
+          <w:sz w:val="22"/>
+          <w:szCs w:val="22"/>
+        </w:rPr>
+        <w:t xml:space="preserve">lowered</w:t>
       </w:r>
       <w:r>
         <w:rPr>

</xml_diff>